<commit_message>
Added rookie OVR boost when drafted to increase odds of filling a team need
</commit_message>
<xml_diff>
--- a/Files/TestFiles/DraftToolToDo.docx
+++ b/Files/TestFiles/DraftToolToDo.docx
@@ -56,6 +56,18 @@
       <w:pPr>
         <w:pStyle w:val="ListParagraph"/>
         <w:numPr>
+          <w:ilvl w:val="1"/>
+          <w:numId w:val="1"/>
+        </w:numPr>
+      </w:pPr>
+      <w:r>
+        <w:t>Roster tab for each team that updates when players are drafted</w:t>
+      </w:r>
+    </w:p>
+    <w:p>
+      <w:pPr>
+        <w:pStyle w:val="ListParagraph"/>
+        <w:numPr>
           <w:ilvl w:val="0"/>
           <w:numId w:val="1"/>
         </w:numPr>
@@ -122,6 +134,36 @@
       </w:pPr>
       <w:r>
         <w:t>Other</w:t>
+      </w:r>
+    </w:p>
+    <w:p>
+      <w:pPr>
+        <w:pStyle w:val="ListParagraph"/>
+        <w:numPr>
+          <w:ilvl w:val="1"/>
+          <w:numId w:val="1"/>
+        </w:numPr>
+      </w:pPr>
+      <w:r>
+        <w:t>Incorporating Combine/Pro Day info for players</w:t>
+      </w:r>
+      <w:r>
+        <w:t xml:space="preserve"> (Ethan to pull needed files)</w:t>
+      </w:r>
+    </w:p>
+    <w:p>
+      <w:pPr>
+        <w:pStyle w:val="ListParagraph"/>
+        <w:numPr>
+          <w:ilvl w:val="1"/>
+          <w:numId w:val="1"/>
+        </w:numPr>
+      </w:pPr>
+      <w:r>
+        <w:t>Incorporate all ~256 picks in draft (not just the first 224 we have now)</w:t>
+      </w:r>
+      <w:r>
+        <w:t xml:space="preserve"> (Ethan to do)</w:t>
       </w:r>
     </w:p>
     <w:p>
@@ -134,13 +176,49 @@
         <w:spacing w:line="259" w:lineRule="auto"/>
       </w:pPr>
       <w:r>
-        <w:t xml:space="preserve">Increase Rookie </w:t>
-      </w:r>
-      <w:r>
-        <w:t>OverallRating</w:t>
-      </w:r>
-      <w:r>
-        <w:t xml:space="preserve"> when drafted</w:t>
+        <w:t xml:space="preserve">User trade up currently just needs </w:t>
+      </w:r>
+      <w:r>
+        <w:t>to offer deal with</w:t>
+      </w:r>
+      <w:r>
+        <w:t xml:space="preserve"> </w:t>
+      </w:r>
+      <w:proofErr w:type="spellStart"/>
+      <w:r>
+        <w:t>max_ratio</w:t>
+      </w:r>
+      <w:proofErr w:type="spellEnd"/>
+      <w:r>
+        <w:t xml:space="preserve"> </w:t>
+      </w:r>
+      <w:r>
+        <w:t xml:space="preserve">to win trades </w:t>
+      </w:r>
+      <w:r>
+        <w:t xml:space="preserve">right now, </w:t>
+      </w:r>
+      <w:proofErr w:type="gramStart"/>
+      <w:r>
+        <w:t>regardless</w:t>
+      </w:r>
+      <w:proofErr w:type="gramEnd"/>
+      <w:r>
+        <w:t xml:space="preserve"> if trade down</w:t>
+      </w:r>
+      <w:r>
+        <w:t xml:space="preserve"> team</w:t>
+      </w:r>
+      <w:r>
+        <w:t xml:space="preserve"> preferred different offer type (Ex. </w:t>
+      </w:r>
+      <w:proofErr w:type="spellStart"/>
+      <w:r>
+        <w:t>Nearest_pick</w:t>
+      </w:r>
+      <w:proofErr w:type="spellEnd"/>
+      <w:r>
+        <w:t xml:space="preserve"> preference)</w:t>
       </w:r>
     </w:p>
     <w:p>
@@ -153,147 +231,14 @@
         <w:spacing w:line="259" w:lineRule="auto"/>
       </w:pPr>
       <w:r>
-        <w:t>Round 1: +5</w:t>
+        <w:t>Need to change, potentially</w:t>
       </w:r>
     </w:p>
     <w:p>
       <w:pPr>
         <w:pStyle w:val="ListParagraph"/>
-        <w:numPr>
-          <w:ilvl w:val="2"/>
-          <w:numId w:val="1"/>
-        </w:numPr>
         <w:spacing w:line="259" w:lineRule="auto"/>
-      </w:pPr>
-      <w:r>
-        <w:t>Round 2-3: +3</w:t>
-      </w:r>
-    </w:p>
-    <w:p>
-      <w:pPr>
-        <w:pStyle w:val="ListParagraph"/>
-        <w:numPr>
-          <w:ilvl w:val="2"/>
-          <w:numId w:val="1"/>
-        </w:numPr>
-        <w:spacing w:line="259" w:lineRule="auto"/>
-      </w:pPr>
-      <w:r>
-        <w:t>Round 4-7: +1</w:t>
-      </w:r>
-    </w:p>
-    <w:p>
-      <w:pPr>
-        <w:pStyle w:val="ListParagraph"/>
-        <w:numPr>
-          <w:ilvl w:val="1"/>
-          <w:numId w:val="1"/>
-        </w:numPr>
-      </w:pPr>
-      <w:r>
-        <w:t>Incorporating Combine/Pro Day info for players</w:t>
-      </w:r>
-      <w:r>
-        <w:t xml:space="preserve"> (Ethan to pull needed files)</w:t>
-      </w:r>
-    </w:p>
-    <w:p>
-      <w:pPr>
-        <w:pStyle w:val="ListParagraph"/>
-        <w:numPr>
-          <w:ilvl w:val="1"/>
-          <w:numId w:val="1"/>
-        </w:numPr>
-      </w:pPr>
-      <w:r>
-        <w:t>Incorporate all ~256 picks in draft (not just the first 224 we have now)</w:t>
-      </w:r>
-      <w:r>
-        <w:t xml:space="preserve"> (Ethan to do)</w:t>
-      </w:r>
-    </w:p>
-    <w:p>
-      <w:pPr>
-        <w:pStyle w:val="ListParagraph"/>
-        <w:numPr>
-          <w:ilvl w:val="1"/>
-          <w:numId w:val="1"/>
-        </w:numPr>
-        <w:spacing w:line="259" w:lineRule="auto"/>
-      </w:pPr>
-      <w:r>
-        <w:t xml:space="preserve">User trade up </w:t>
-      </w:r>
-      <w:r>
-        <w:t xml:space="preserve">currently </w:t>
-      </w:r>
-      <w:r>
-        <w:t xml:space="preserve">just needs </w:t>
-      </w:r>
-      <w:r>
-        <w:t>to offer deal with</w:t>
-      </w:r>
-      <w:r>
-        <w:t xml:space="preserve"> </w:t>
-      </w:r>
-      <w:proofErr w:type="spellStart"/>
-      <w:r>
-        <w:t>max_ratio</w:t>
-      </w:r>
-      <w:proofErr w:type="spellEnd"/>
-      <w:r>
-        <w:t xml:space="preserve"> </w:t>
-      </w:r>
-      <w:r>
-        <w:t xml:space="preserve">to win trades </w:t>
-      </w:r>
-      <w:r>
-        <w:t xml:space="preserve">right now, </w:t>
-      </w:r>
-      <w:proofErr w:type="gramStart"/>
-      <w:r>
-        <w:t>regardless</w:t>
-      </w:r>
-      <w:proofErr w:type="gramEnd"/>
-      <w:r>
-        <w:t xml:space="preserve"> if trade down</w:t>
-      </w:r>
-      <w:r>
-        <w:t xml:space="preserve"> team</w:t>
-      </w:r>
-      <w:r>
-        <w:t xml:space="preserve"> preferred different offer type (Ex. </w:t>
-      </w:r>
-      <w:proofErr w:type="spellStart"/>
-      <w:r>
-        <w:t>Nearest_pick</w:t>
-      </w:r>
-      <w:proofErr w:type="spellEnd"/>
-      <w:r>
-        <w:t xml:space="preserve"> preference)</w:t>
-      </w:r>
-    </w:p>
-    <w:p>
-      <w:pPr>
-        <w:pStyle w:val="ListParagraph"/>
-        <w:numPr>
-          <w:ilvl w:val="2"/>
-          <w:numId w:val="1"/>
-        </w:numPr>
-        <w:spacing w:line="259" w:lineRule="auto"/>
-      </w:pPr>
-      <w:r>
-        <w:t>Need to change, potentially</w:t>
-      </w:r>
-    </w:p>
-    <w:p>
-      <w:pPr>
-        <w:pStyle w:val="ListParagraph"/>
-        <w:numPr>
-          <w:ilvl w:val="2"/>
-          <w:numId w:val="1"/>
-        </w:numPr>
-        <w:spacing w:line="259" w:lineRule="auto"/>
+        <w:ind w:left="2160"/>
       </w:pPr>
     </w:p>
     <w:sectPr>

</xml_diff>

<commit_message>
Add combine/pro day data to player profile with position rankings
</commit_message>
<xml_diff>
--- a/Files/TestFiles/DraftToolToDo.docx
+++ b/Files/TestFiles/DraftToolToDo.docx
@@ -26,15 +26,7 @@
         </w:numPr>
       </w:pPr>
       <w:r>
-        <w:t xml:space="preserve">GM styles/traits tab (Read off </w:t>
-      </w:r>
-      <w:proofErr w:type="spellStart"/>
-      <w:r>
-        <w:t>GMInfo</w:t>
-      </w:r>
-      <w:proofErr w:type="spellEnd"/>
-      <w:r>
-        <w:t xml:space="preserve"> doc)</w:t>
+        <w:t>GM styles/traits tab (Read off GMInfo doc)</w:t>
       </w:r>
     </w:p>
     <w:p>
@@ -97,58 +89,7 @@
         </w:numPr>
       </w:pPr>
       <w:r>
-        <w:t>UI tweaks</w:t>
-      </w:r>
-    </w:p>
-    <w:p>
-      <w:pPr>
-        <w:pStyle w:val="ListParagraph"/>
-        <w:numPr>
-          <w:ilvl w:val="1"/>
-          <w:numId w:val="1"/>
-        </w:numPr>
-      </w:pPr>
-      <w:r>
-        <w:t xml:space="preserve">When CPU offers User team a trade, </w:t>
-      </w:r>
-      <w:r>
-        <w:t xml:space="preserve">in the Trade Hub view, </w:t>
-      </w:r>
-      <w:r>
-        <w:t xml:space="preserve">next to “Net Value”, show “Net Ratio” </w:t>
-      </w:r>
-      <w:r>
-        <w:t xml:space="preserve">as well </w:t>
-      </w:r>
-      <w:r>
-        <w:t>which is (Total value of picks CPU offered the User) / (Total Value of Picks User is sending back)</w:t>
-      </w:r>
-    </w:p>
-    <w:p>
-      <w:pPr>
-        <w:pStyle w:val="ListParagraph"/>
-        <w:numPr>
-          <w:ilvl w:val="0"/>
-          <w:numId w:val="1"/>
-        </w:numPr>
-      </w:pPr>
-      <w:r>
         <w:t>Other</w:t>
-      </w:r>
-    </w:p>
-    <w:p>
-      <w:pPr>
-        <w:pStyle w:val="ListParagraph"/>
-        <w:numPr>
-          <w:ilvl w:val="1"/>
-          <w:numId w:val="1"/>
-        </w:numPr>
-      </w:pPr>
-      <w:r>
-        <w:t>Incorporating Combine/Pro Day info for players</w:t>
-      </w:r>
-      <w:r>
-        <w:t xml:space="preserve"> (Ethan to pull needed files)</w:t>
       </w:r>
     </w:p>
     <w:p>
@@ -182,43 +123,19 @@
         <w:t>to offer deal with</w:t>
       </w:r>
       <w:r>
-        <w:t xml:space="preserve"> </w:t>
-      </w:r>
-      <w:proofErr w:type="spellStart"/>
-      <w:r>
-        <w:t>max_ratio</w:t>
-      </w:r>
-      <w:proofErr w:type="spellEnd"/>
-      <w:r>
-        <w:t xml:space="preserve"> </w:t>
+        <w:t xml:space="preserve"> max_ratio </w:t>
       </w:r>
       <w:r>
         <w:t xml:space="preserve">to win trades </w:t>
       </w:r>
       <w:r>
-        <w:t xml:space="preserve">right now, </w:t>
-      </w:r>
-      <w:proofErr w:type="gramStart"/>
-      <w:r>
-        <w:t>regardless</w:t>
-      </w:r>
-      <w:proofErr w:type="gramEnd"/>
-      <w:r>
-        <w:t xml:space="preserve"> if trade down</w:t>
+        <w:t>right now, regardless if trade down</w:t>
       </w:r>
       <w:r>
         <w:t xml:space="preserve"> team</w:t>
       </w:r>
       <w:r>
-        <w:t xml:space="preserve"> preferred different offer type (Ex. </w:t>
-      </w:r>
-      <w:proofErr w:type="spellStart"/>
-      <w:r>
-        <w:t>Nearest_pick</w:t>
-      </w:r>
-      <w:proofErr w:type="spellEnd"/>
-      <w:r>
-        <w:t xml:space="preserve"> preference)</w:t>
+        <w:t xml:space="preserve"> preferred different offer type (Ex. Nearest_pick preference)</w:t>
       </w:r>
     </w:p>
     <w:p>

</xml_diff>

<commit_message>
Fix exporter writing wrong team ID for traded picks, add all 256 draft picks (instead of 224)
</commit_message>
<xml_diff>
--- a/Files/TestFiles/DraftToolToDo.docx
+++ b/Files/TestFiles/DraftToolToDo.docx
@@ -90,21 +90,6 @@
       </w:pPr>
       <w:r>
         <w:t>Other</w:t>
-      </w:r>
-    </w:p>
-    <w:p>
-      <w:pPr>
-        <w:pStyle w:val="ListParagraph"/>
-        <w:numPr>
-          <w:ilvl w:val="1"/>
-          <w:numId w:val="1"/>
-        </w:numPr>
-      </w:pPr>
-      <w:r>
-        <w:t>Incorporate all ~256 picks in draft (not just the first 224 we have now)</w:t>
-      </w:r>
-      <w:r>
-        <w:t xml:space="preserve"> (Ethan to do)</w:t>
       </w:r>
     </w:p>
     <w:p>

</xml_diff>

<commit_message>
Add GM Info tab, hide rookie OVR in Rosters, remove display of need weights
</commit_message>
<xml_diff>
--- a/Files/TestFiles/DraftToolToDo.docx
+++ b/Files/TestFiles/DraftToolToDo.docx
@@ -2,84 +2,6 @@
 <file path=word/document.xml><?xml version="1.0" encoding="utf-8"?>
 <w:document xmlns:wpc="http://schemas.microsoft.com/office/word/2010/wordprocessingCanvas" xmlns:cx="http://schemas.microsoft.com/office/drawing/2014/chartex" xmlns:cx1="http://schemas.microsoft.com/office/drawing/2015/9/8/chartex" xmlns:cx2="http://schemas.microsoft.com/office/drawing/2015/10/21/chartex" xmlns:cx3="http://schemas.microsoft.com/office/drawing/2016/5/9/chartex" xmlns:cx4="http://schemas.microsoft.com/office/drawing/2016/5/10/chartex" xmlns:cx5="http://schemas.microsoft.com/office/drawing/2016/5/11/chartex" xmlns:cx6="http://schemas.microsoft.com/office/drawing/2016/5/12/chartex" xmlns:cx7="http://schemas.microsoft.com/office/drawing/2016/5/13/chartex" xmlns:cx8="http://schemas.microsoft.com/office/drawing/2016/5/14/chartex" xmlns:mc="http://schemas.openxmlformats.org/markup-compatibility/2006" xmlns:aink="http://schemas.microsoft.com/office/drawing/2016/ink" xmlns:am3d="http://schemas.microsoft.com/office/drawing/2017/model3d" xmlns:o="urn:schemas-microsoft-com:office:office" xmlns:oel="http://schemas.microsoft.com/office/2019/extlst" xmlns:r="http://schemas.openxmlformats.org/officeDocument/2006/relationships" xmlns:m="http://schemas.openxmlformats.org/officeDocument/2006/math" xmlns:v="urn:schemas-microsoft-com:vml" xmlns:wp14="http://schemas.microsoft.com/office/word/2010/wordprocessingDrawing" xmlns:wp="http://schemas.openxmlformats.org/drawingml/2006/wordprocessingDrawing" xmlns:w10="urn:schemas-microsoft-com:office:word" xmlns:w="http://schemas.openxmlformats.org/wordprocessingml/2006/main" xmlns:w14="http://schemas.microsoft.com/office/word/2010/wordml" xmlns:w15="http://schemas.microsoft.com/office/word/2012/wordml" xmlns:w16cex="http://schemas.microsoft.com/office/word/2018/wordml/cex" xmlns:w16cid="http://schemas.microsoft.com/office/word/2016/wordml/cid" xmlns:w16="http://schemas.microsoft.com/office/word/2018/wordml" xmlns:w16du="http://schemas.microsoft.com/office/word/2023/wordml/word16du" xmlns:w16sdtdh="http://schemas.microsoft.com/office/word/2020/wordml/sdtdatahash" xmlns:w16sdtfl="http://schemas.microsoft.com/office/word/2024/wordml/sdtformatlock" xmlns:w16se="http://schemas.microsoft.com/office/word/2015/wordml/symex" xmlns:wpg="http://schemas.microsoft.com/office/word/2010/wordprocessingGroup" xmlns:wpi="http://schemas.microsoft.com/office/word/2010/wordprocessingInk" xmlns:wne="http://schemas.microsoft.com/office/word/2006/wordml" xmlns:wps="http://schemas.microsoft.com/office/word/2010/wordprocessingShape" mc:Ignorable="w14 w15 w16se w16cid w16 w16cex w16sdtdh w16sdtfl w16du wp14">
   <w:body>
-    <w:p>
-      <w:pPr>
-        <w:pStyle w:val="ListParagraph"/>
-        <w:numPr>
-          <w:ilvl w:val="0"/>
-          <w:numId w:val="1"/>
-        </w:numPr>
-      </w:pPr>
-      <w:r>
-        <w:t>Tabs</w:t>
-      </w:r>
-      <w:r>
-        <w:t xml:space="preserve"> to add</w:t>
-      </w:r>
-    </w:p>
-    <w:p>
-      <w:pPr>
-        <w:pStyle w:val="ListParagraph"/>
-        <w:numPr>
-          <w:ilvl w:val="1"/>
-          <w:numId w:val="1"/>
-        </w:numPr>
-      </w:pPr>
-      <w:r>
-        <w:t>GM styles/traits tab (Read off GMInfo doc)</w:t>
-      </w:r>
-    </w:p>
-    <w:p>
-      <w:pPr>
-        <w:pStyle w:val="ListParagraph"/>
-        <w:numPr>
-          <w:ilvl w:val="1"/>
-          <w:numId w:val="1"/>
-        </w:numPr>
-      </w:pPr>
-      <w:r>
-        <w:t>Previous Trades</w:t>
-      </w:r>
-      <w:r>
-        <w:t xml:space="preserve"> (view trades that occurred during draft)</w:t>
-      </w:r>
-    </w:p>
-    <w:p>
-      <w:pPr>
-        <w:pStyle w:val="ListParagraph"/>
-        <w:numPr>
-          <w:ilvl w:val="1"/>
-          <w:numId w:val="1"/>
-        </w:numPr>
-      </w:pPr>
-      <w:r>
-        <w:t>Roster tab for each team that updates when players are drafted</w:t>
-      </w:r>
-    </w:p>
-    <w:p>
-      <w:pPr>
-        <w:pStyle w:val="ListParagraph"/>
-        <w:numPr>
-          <w:ilvl w:val="0"/>
-          <w:numId w:val="1"/>
-        </w:numPr>
-      </w:pPr>
-      <w:r>
-        <w:t>Things to add</w:t>
-      </w:r>
-    </w:p>
-    <w:p>
-      <w:pPr>
-        <w:pStyle w:val="ListParagraph"/>
-        <w:numPr>
-          <w:ilvl w:val="1"/>
-          <w:numId w:val="1"/>
-        </w:numPr>
-      </w:pPr>
-      <w:r>
-        <w:t>Either add to Trade Hub or make a different spot for us to create manual trades between any two teams and have a “Override Trade” button we can check that bypasses any trade offer to automatically be accepted</w:t>
-      </w:r>
-    </w:p>
     <w:p>
       <w:pPr>
         <w:pStyle w:val="ListParagraph"/>
@@ -108,19 +30,43 @@
         <w:t>to offer deal with</w:t>
       </w:r>
       <w:r>
-        <w:t xml:space="preserve"> max_ratio </w:t>
+        <w:t xml:space="preserve"> </w:t>
+      </w:r>
+      <w:proofErr w:type="spellStart"/>
+      <w:r>
+        <w:t>max_ratio</w:t>
+      </w:r>
+      <w:proofErr w:type="spellEnd"/>
+      <w:r>
+        <w:t xml:space="preserve"> </w:t>
       </w:r>
       <w:r>
         <w:t xml:space="preserve">to win trades </w:t>
       </w:r>
       <w:r>
-        <w:t>right now, regardless if trade down</w:t>
+        <w:t xml:space="preserve">right now, </w:t>
+      </w:r>
+      <w:proofErr w:type="gramStart"/>
+      <w:r>
+        <w:t>regardless</w:t>
+      </w:r>
+      <w:proofErr w:type="gramEnd"/>
+      <w:r>
+        <w:t xml:space="preserve"> if trade down</w:t>
       </w:r>
       <w:r>
         <w:t xml:space="preserve"> team</w:t>
       </w:r>
       <w:r>
-        <w:t xml:space="preserve"> preferred different offer type (Ex. Nearest_pick preference)</w:t>
+        <w:t xml:space="preserve"> preferred different offer type (Ex. </w:t>
+      </w:r>
+      <w:proofErr w:type="spellStart"/>
+      <w:r>
+        <w:t>Nearest_pick</w:t>
+      </w:r>
+      <w:proofErr w:type="spellEnd"/>
+      <w:r>
+        <w:t xml:space="preserve"> preference)</w:t>
       </w:r>
     </w:p>
     <w:p>
@@ -134,6 +80,58 @@
       </w:pPr>
       <w:r>
         <w:t>Need to change, potentially</w:t>
+      </w:r>
+    </w:p>
+    <w:p>
+      <w:pPr>
+        <w:pStyle w:val="ListParagraph"/>
+        <w:numPr>
+          <w:ilvl w:val="1"/>
+          <w:numId w:val="1"/>
+        </w:numPr>
+        <w:spacing w:line="259" w:lineRule="auto"/>
+      </w:pPr>
+      <w:r>
+        <w:t>+5 for all rookies drafted</w:t>
+      </w:r>
+    </w:p>
+    <w:p>
+      <w:pPr>
+        <w:pStyle w:val="ListParagraph"/>
+        <w:numPr>
+          <w:ilvl w:val="1"/>
+          <w:numId w:val="1"/>
+        </w:numPr>
+        <w:spacing w:line="259" w:lineRule="auto"/>
+      </w:pPr>
+      <w:r>
+        <w:t>More likely to trade if BPA on board in round 1 and no need</w:t>
+      </w:r>
+    </w:p>
+    <w:p>
+      <w:pPr>
+        <w:pStyle w:val="ListParagraph"/>
+        <w:numPr>
+          <w:ilvl w:val="1"/>
+          <w:numId w:val="1"/>
+        </w:numPr>
+        <w:spacing w:line="259" w:lineRule="auto"/>
+      </w:pPr>
+      <w:r>
+        <w:t>Add 0.05 trade down consideration top 10</w:t>
+      </w:r>
+    </w:p>
+    <w:p>
+      <w:pPr>
+        <w:pStyle w:val="ListParagraph"/>
+        <w:numPr>
+          <w:ilvl w:val="1"/>
+          <w:numId w:val="1"/>
+        </w:numPr>
+        <w:spacing w:line="259" w:lineRule="auto"/>
+      </w:pPr>
+      <w:r>
+        <w:t>Limit range in early 1st</w:t>
       </w:r>
     </w:p>
     <w:p>

</xml_diff>

<commit_message>
Big board floor tightening, rookie OVR boost tuning, trade probability adjustments
</commit_message>
<xml_diff>
--- a/Files/TestFiles/DraftToolToDo.docx
+++ b/Files/TestFiles/DraftToolToDo.docx
@@ -80,58 +80,6 @@
       </w:pPr>
       <w:r>
         <w:t>Need to change, potentially</w:t>
-      </w:r>
-    </w:p>
-    <w:p>
-      <w:pPr>
-        <w:pStyle w:val="ListParagraph"/>
-        <w:numPr>
-          <w:ilvl w:val="1"/>
-          <w:numId w:val="1"/>
-        </w:numPr>
-        <w:spacing w:line="259" w:lineRule="auto"/>
-      </w:pPr>
-      <w:r>
-        <w:t>+5 for all rookies drafted</w:t>
-      </w:r>
-    </w:p>
-    <w:p>
-      <w:pPr>
-        <w:pStyle w:val="ListParagraph"/>
-        <w:numPr>
-          <w:ilvl w:val="1"/>
-          <w:numId w:val="1"/>
-        </w:numPr>
-        <w:spacing w:line="259" w:lineRule="auto"/>
-      </w:pPr>
-      <w:r>
-        <w:t>More likely to trade if BPA on board in round 1 and no need</w:t>
-      </w:r>
-    </w:p>
-    <w:p>
-      <w:pPr>
-        <w:pStyle w:val="ListParagraph"/>
-        <w:numPr>
-          <w:ilvl w:val="1"/>
-          <w:numId w:val="1"/>
-        </w:numPr>
-        <w:spacing w:line="259" w:lineRule="auto"/>
-      </w:pPr>
-      <w:r>
-        <w:t>Add 0.05 trade down consideration top 10</w:t>
-      </w:r>
-    </w:p>
-    <w:p>
-      <w:pPr>
-        <w:pStyle w:val="ListParagraph"/>
-        <w:numPr>
-          <w:ilvl w:val="1"/>
-          <w:numId w:val="1"/>
-        </w:numPr>
-        <w:spacing w:line="259" w:lineRule="auto"/>
-      </w:pPr>
-      <w:r>
-        <w:t>Limit range in early 1st</w:t>
       </w:r>
     </w:p>
     <w:p>

</xml_diff>